<commit_message>
docs: fix remaining Ichnos references in pricing strategy doc
</commit_message>
<xml_diff>
--- a/docs/DataFe_Pricing_Strategy.docx
+++ b/docs/DataFe_Pricing_Strategy.docx
@@ -14,7 +14,7 @@
           <w:sz w:val="56"/>
           <w:szCs w:val="56"/>
         </w:rPr>
-        <w:t xml:space="preserve">ICHNOS</w:t>
+        <w:t xml:space="preserve">DATAFE</w:t>
       </w:r>
     </w:p>
     <w:p>
@@ -71,7 +71,7 @@
         <w:spacing w:after="160"/>
       </w:pPr>
       <w:r>
-        <w:t xml:space="preserve">Ichnos is a metadata catalog and data governance platform - the kind of system Collibra and Informatica sell to large enterprises - built for small and mid-size companies that have real governance needs (PII exposure, scattered ownership, no single source of truth for “what is this data and who owns it”) but no budget or headcount for an enterprise governance program. This document proposes a self-serve, transparently priced tier structure that undercuts the incumbent players by one to two orders of magnitude, prices primarily on the size of the data estate being governed rather than on every person who merely needs to look something up, and uses a genuine free tier as the growth engine rather than a lead-gated demo.</w:t>
+        <w:t xml:space="preserve">DataFe is a metadata catalog and data governance platform - the kind of system Collibra and Informatica sell to large enterprises - built for small and mid-size companies that have real governance needs (PII exposure, scattered ownership, no single source of truth for “what is this data and who owns it”) but no budget or headcount for an enterprise governance program. This document proposes a self-serve, transparently priced tier structure that undercuts the incumbent players by one to two orders of magnitude, prices primarily on the size of the data estate being governed rather than on every person who merely needs to look something up, and uses a genuine free tier as the growth engine rather than a lead-gated demo.</w:t>
       </w:r>
     </w:p>
     <w:p>
@@ -843,7 +843,7 @@
                 <w:sz w:val="18"/>
                 <w:szCs w:val="18"/>
               </w:rPr>
-              <w:t xml:space="preserve">Ichnos (proposed)</w:t>
+              <w:t xml:space="preserve">DataFe (proposed)</w:t>
             </w:r>
           </w:p>
         </w:tc>
@@ -956,7 +956,7 @@
         <w:spacing w:after="160"/>
       </w:pPr>
       <w:r>
-        <w:t xml:space="preserve">Three gaps this creates that Ichnos can occupy:</w:t>
+        <w:t xml:space="preserve">Three gaps this creates that DataFe can occupy:</w:t>
       </w:r>
     </w:p>
     <w:p>
@@ -995,7 +995,7 @@
         <w:spacing w:after="80"/>
       </w:pPr>
       <w:r>
-        <w:t xml:space="preserve">Small-estate pricing that doesn't cliff-edge into enterprise territory. Atlan's free tier is genuinely useful for one person; the moment a small company needs its actual team (not just one admin) using the tool, list price jumps to five figures a year. Ichnos's Team and Business tiers are built to hold a real 5–50 person company comfortably below that jump.</w:t>
+        <w:t xml:space="preserve">Small-estate pricing that doesn't cliff-edge into enterprise territory. Atlan's free tier is genuinely useful for one person; the moment a small company needs its actual team (not just one admin) using the tool, list price jumps to five figures a year. DataFe's Team and Business tiers are built to hold a real 5–50 person company comfortably below that jump.</w:t>
       </w:r>
     </w:p>
     <w:p>
@@ -1059,7 +1059,7 @@
         <w:spacing w:after="160"/>
       </w:pPr>
       <w:r>
-        <w:t xml:space="preserve">This buyer has evaluated or would evaluate Atlan or Select Star, been quoted a number that assumes a dedicated platform team, and is currently doing nothing (or maintaining a spreadsheet) instead. Ichnos's job is to be the tool this buyer can put on a company card today, not the tool that requires a procurement cycle.</w:t>
+        <w:t xml:space="preserve">This buyer has evaluated or would evaluate Atlan or Select Star, been quoted a number that assumes a dedicated platform team, and is currently doing nothing (or maintaining a spreadsheet) instead. DataFe's job is to be the tool this buyer can put on a company card today, not the tool that requires a procurement cycle.</w:t>
       </w:r>
     </w:p>
     <w:p>
@@ -3623,7 +3623,7 @@
         <w:spacing w:after="80"/>
       </w:pPr>
       <w:r>
-        <w:t xml:space="preserve">Metered AI as a later lever, not a launch complexity. Atlan already prices its AI assistant as a separate per-user or usage add-on. Bundling Ichnos's Ask assistant into Team/Business with a fair-use cap keeps the initial pricing story simple; a metered add-on for heavy usage is a natural lever to introduce once usage data exists, not before.</w:t>
+        <w:t xml:space="preserve">Metered AI as a later lever, not a launch complexity. Atlan already prices its AI assistant as a separate per-user or usage add-on. Bundling DataFe's Ask assistant into Team/Business with a fair-use cap keeps the initial pricing story simple; a metered add-on for heavy usage is a natural lever to introduce once usage data exists, not before.</w:t>
       </w:r>
     </w:p>
     <w:p>

</xml_diff>